<commit_message>
docs: update SiasatAI_Technical_Report.docx with Edge Middleware rate limiting and toast alert details
</commit_message>
<xml_diff>
--- a/SiasatAI_Technical_Report.docx
+++ b/SiasatAI_Technical_Report.docx
@@ -550,43 +550,7 @@
         <w:jc w:val="both"/>
       </w:pPr>
       <w:r>
-        <w:rPr>
-          <w:rFonts w:ascii="Times New Roman" w:hAnsi="Times New Roman"/>
-          <w:sz w:val="20"/>
-        </w:rPr>
-        <w:t xml:space="preserve">The system separates offline training from online prediction. The backend API is built using </w:t>
-      </w:r>
-      <w:proofErr w:type="spellStart"/>
-      <w:r>
-        <w:rPr>
-          <w:rFonts w:ascii="Times New Roman" w:hAnsi="Times New Roman"/>
-          <w:sz w:val="20"/>
-        </w:rPr>
-        <w:t>FastAPI</w:t>
-      </w:r>
-      <w:proofErr w:type="spellEnd"/>
-      <w:r>
-        <w:rPr>
-          <w:rFonts w:ascii="Times New Roman" w:hAnsi="Times New Roman"/>
-          <w:sz w:val="20"/>
-        </w:rPr>
-        <w:t xml:space="preserve"> (Python 3.10+), which loads the serialized models on startup using pickle. The frontend dashboard is constructed with clean, semantic HTML, vanilla CSS, and vanilla JavaScript. Dynamic charts (such as top fake/real keywords based on model weights) are pulled directly from the API endpoints, and a custom canvas-rendered word frequency cloud displays the word signals of the analyzed text. The entire stack is deployed on </w:t>
-      </w:r>
-      <w:proofErr w:type="spellStart"/>
-      <w:r>
-        <w:rPr>
-          <w:rFonts w:ascii="Times New Roman" w:hAnsi="Times New Roman"/>
-          <w:sz w:val="20"/>
-        </w:rPr>
-        <w:t>Vercel's</w:t>
-      </w:r>
-      <w:proofErr w:type="spellEnd"/>
-      <w:r>
-        <w:rPr>
-          <w:rFonts w:ascii="Times New Roman" w:hAnsi="Times New Roman"/>
-          <w:sz w:val="20"/>
-        </w:rPr>
-        <w:t xml:space="preserve"> serverless platform, routing API traffic and serving static assets from an optimized CDN.</w:t>
+        <w:t>The system separates offline training from online prediction. The backend API is built using FastAPI (Python 3.10+), which loads the serialized models on startup using pickle. The frontend dashboard is constructed with clean, semantic HTML, vanilla CSS, and vanilla JavaScript. Dynamic charts (such as top fake/real keywords based on model weights) are pulled directly from the API endpoints, and a custom canvas-rendered word frequency cloud displays the word signals of the analyzed text. The entire stack is deployed on Vercel's serverless platform, routing API traffic and serving static assets from an optimized CDN. To protect the serverless backend from denial-of-service (DoS) attempts and compute billing spikes, an asynchronous Edge Middleware (middleware.js) is deployed at the Vercel CDN layer. This middleware intercepts all incoming requests to /api/predict at the edge and enforces a rate limit of 10 requests per minute per IP address. The rate limiter maintains client request counts in a cloud-hosted Upstash Redis key-value store using direct pipeline HTTP/REST commands, reverting to a fail-open fallback if the database becomes unreachable.</w:t>
       </w:r>
     </w:p>
     <w:p>
@@ -1592,43 +1556,7 @@
         <w:jc w:val="both"/>
       </w:pPr>
       <w:r>
-        <w:rPr>
-          <w:rFonts w:ascii="Times New Roman" w:hAnsi="Times New Roman"/>
-          <w:sz w:val="20"/>
-        </w:rPr>
-        <w:t xml:space="preserve">The client interface is designed with a dark, premium </w:t>
-      </w:r>
-      <w:proofErr w:type="spellStart"/>
-      <w:r>
-        <w:rPr>
-          <w:rFonts w:ascii="Times New Roman" w:hAnsi="Times New Roman"/>
-          <w:sz w:val="20"/>
-        </w:rPr>
-        <w:t>glassmorphism</w:t>
-      </w:r>
-      <w:proofErr w:type="spellEnd"/>
-      <w:r>
-        <w:rPr>
-          <w:rFonts w:ascii="Times New Roman" w:hAnsi="Times New Roman"/>
-          <w:sz w:val="20"/>
-        </w:rPr>
-        <w:t xml:space="preserve"> theme to provide an engaging user experience. When a municipal officer pastes text into the analyzer, the system displays the classification label alongside an animated confidence gauge. It also renders the Sensationalism Tone Meter, language metadata, a bilingual AI explanation summary, and an interactive canvas word cloud. A collapsible sidebar displays current model specifications and the top 5 global model coefficients for both real and fake classes. Additionally, </w:t>
-      </w:r>
-      <w:proofErr w:type="gramStart"/>
-      <w:r>
-        <w:rPr>
-          <w:rFonts w:ascii="Times New Roman" w:hAnsi="Times New Roman"/>
-          <w:sz w:val="20"/>
-        </w:rPr>
-        <w:t>an</w:t>
-      </w:r>
-      <w:proofErr w:type="gramEnd"/>
-      <w:r>
-        <w:rPr>
-          <w:rFonts w:ascii="Times New Roman" w:hAnsi="Times New Roman"/>
-          <w:sz w:val="20"/>
-        </w:rPr>
-        <w:t xml:space="preserve"> feedback report system using Web3Forms is integrated to allow users to report false classifications, forwarding the metadata directly to council administrators.</w:t>
+        <w:t>The client interface is designed with a dark, premium glassmorphism theme to provide an engaging user experience. When a municipal officer pastes text into the analyzer, the system displays the classification label alongside an animated confidence gauge. It also renders the Sensationalism Tone Meter, language metadata, a bilingual AI explanation summary, and an interactive canvas word cloud. A collapsible sidebar displays current model specifications and the top 5 global model coefficients for both real and fake classes. Additionally, an feedback report system using Web3Forms is integrated to allow users to report false classifications, forwarding the metadata directly to council administrators. For enhanced accessibility and clear visual hierarchy, a top-centered toast notification system is implemented to display validation alerts, clipboard actions, and rate limit blocks without obstructing dashboard content.</w:t>
       </w:r>
     </w:p>
     <w:p>

</xml_diff>

<commit_message>
chore: add backend_rules.md to ignore list and update technical report document
</commit_message>
<xml_diff>
--- a/SiasatAI_Technical_Report.docx
+++ b/SiasatAI_Technical_Report.docx
@@ -92,7 +92,14 @@
           <w:rFonts w:ascii="Times New Roman" w:hAnsi="Times New Roman"/>
           <w:sz w:val="18"/>
         </w:rPr>
-        <w:t>The rapid spread of online misinformation, social media rumors, and fake news poses a significant challenge for local municipal governance, especially for Majlis Bandaraya Melaka Bersejarah (MBMB). In Malaysia's bilingual context, public discourse often contains a mix of Bahasa Malaysia and English, making global fact-checking tools ineffective. This paper presents SiasatAI, a bilingual misinformation detection system tailored for MBMB. Following the CRISP-DM methodology, we gathered and preprocessed a balanced dataset of 63,897 bilingual news articles and social media posts, combining the Academic Malay dataset, a Global English dataset, and live-scraped local reports from Sebenarnya.my. Using TF-IDF with n-gram features (1, 2) and sublinear Term Frequency scaling, we evaluated four machine learning classifiers in a multi-model tournament: Logistic Regression, Linear Support Vector Machine, XGBoost, and Random Forest. Logistic Regression achieved the highest accuracy of 93.60% while maintaining a minimal combined file footprint (under 0.5 MB) suitable for serverless deployment on Vercel. SiasatAI features an interactive web dashboard with an AI confidence score gauge, a sensationalism tone meter, bilingual AI explanation summaries, a canvas-rendered word cloud, and user feedback integration. The system offers real-time inference in less than 2 milliseconds, allowing municipal officers to proactively monitor, verify, and counter viral rumors.</w:t>
+        <w:t xml:space="preserve">The rapid spread of online misinformation, social media rumors, and fake news poses a significant challenge for local municipal governance, especially for Majlis Bandaraya Melaka Bersejarah (MBMB). In Malaysia's bilingual context, public discourse often contains a mix of Bahasa Malaysia and English, making global fact-checking tools ineffective. This paper presents SiasatAI, a bilingual misinformation detection system tailored for MBMB. Following the CRISP-DM methodology, we gathered and preprocessed a balanced dataset of 63,897 bilingual news articles and social media posts, combining the Academic Malay dataset, a Global English dataset, and live-scraped local reports from Sebenarnya.my. Using TF-IDF with n-gram features (1, 2) and sublinear Term Frequency scaling, we evaluated four machine learning classifiers in a multi-model tournament: Logistic Regression, Linear Support Vector Machine, XGBoost, and Random Forest. Logistic Regression achieved the highest accuracy of 93.60% while maintaining a minimal combined file footprint (under 0.5 MB) suitable for serverless deployment on Vercel. SiasatAI features an interactive web dashboard with an AI confidence score gauge, a sensationalism tone meter, bilingual AI explanation summaries, a canvas-rendered word cloud, and user feedback integration. The system offers real-time inference in less than 2 milliseconds, allowing </w:t>
+      </w:r>
+      <w:r>
+        <w:rPr>
+          <w:rFonts w:ascii="Times New Roman" w:hAnsi="Times New Roman"/>
+          <w:sz w:val="18"/>
+        </w:rPr>
+        <w:t>municipal officers to proactively monitor, verify, and counter viral rumors.</w:t>
       </w:r>
     </w:p>
     <w:p>
@@ -167,7 +174,7 @@
           <w:rFonts w:ascii="Times New Roman" w:hAnsi="Times New Roman"/>
           <w:sz w:val="20"/>
         </w:rPr>
-        <w:t xml:space="preserve">The contributions of this paper are fourfold: (1) a CRISP-DM-based framework for integrating multi-source bilingual online datasets, including official reports and scraped local rumors; (2) a comparative evaluation of four classification algorithms (Logistic Regression, Support Vector Machine, XGBoost, and Random Forest) on bilingual text representations; (3) an early warning approach that combines machine </w:t>
+        <w:t xml:space="preserve">The contributions of this paper are fourfold: (1) a CRISP-DM-based framework for integrating multi-source bilingual online datasets, including official reports and scraped local rumors; (2) a comparative evaluation of four classification algorithms (Logistic Regression, Support Vector </w:t>
       </w:r>
       <w:r>
         <w:rPr>
@@ -175,7 +182,7 @@
           <w:sz w:val="20"/>
         </w:rPr>
         <w:lastRenderedPageBreak/>
-        <w:t>learning confidence scores with lexical sensationalism scores to flag high-risk viral texts; and (4) a serverless web dashboard deployed on Vercel to support real-time, evidence-based decision-making.</w:t>
+        <w:t>Machine, XGBoost, and Random Forest) on bilingual text representations; (3) an early warning approach that combines machine learning confidence scores with lexical sensationalism scores to flag high-risk viral texts; and (4) a serverless web dashboard deployed on Vercel to support real-time, evidence-based decision-making.</w:t>
       </w:r>
     </w:p>
     <w:p>
@@ -229,7 +236,6 @@
           <w:b/>
           <w:sz w:val="24"/>
         </w:rPr>
-        <w:lastRenderedPageBreak/>
         <w:t>3 Dataset and Data Preparation</w:t>
       </w:r>
     </w:p>
@@ -317,7 +323,15 @@
           <w:rFonts w:ascii="Times New Roman" w:hAnsi="Times New Roman"/>
           <w:sz w:val="20"/>
         </w:rPr>
-        <w:t>The dataset compiled for this project contains a total of 63,897 articles after cleaning, sourced from three major streams: (1) the Academic Malay Dataset, consisting of approximately 37,463 articles gathered from official local publications (Bernama, Astro Awani, Sinar Harian); (2) a Global English Dataset, comprising 24,248 articles from public Kaggle/HuggingFace datasets; and (3) a Live Scraped Dataset, containing 2,244 local rumor posts scraped directly from the Sebenarnya.my fact-checking portal. Additionally, the dataset was oversampled with municipal-specific mock reports (e.g., related to MBMB parking fines, tax policies, and council announcements) to ensure the system is highly sensitive to municipal-oriented misinformation.</w:t>
+        <w:t xml:space="preserve">The dataset compiled for this project contains a total of 63,897 articles after cleaning, sourced from three major streams: (1) the Academic Malay Dataset, consisting of approximately 37,463 articles gathered from official local publications (Bernama, Astro Awani, Sinar Harian); (2) a Global English Dataset, comprising 24,248 articles from public Kaggle/HuggingFace datasets; and (3) a Live Scraped Dataset, containing 2,244 local rumor posts scraped directly from the Sebenarnya.my fact-checking portal. Additionally, the dataset was oversampled with municipal-specific mock reports (e.g., related to MBMB parking fines, tax policies, and council announcements) to ensure </w:t>
+      </w:r>
+      <w:r>
+        <w:rPr>
+          <w:rFonts w:ascii="Times New Roman" w:hAnsi="Times New Roman"/>
+          <w:sz w:val="20"/>
+        </w:rPr>
+        <w:lastRenderedPageBreak/>
+        <w:t>the system is highly sensitive to municipal-oriented misinformation.</w:t>
       </w:r>
     </w:p>
     <w:p>
@@ -344,15 +358,7 @@
           <w:rFonts w:ascii="Times New Roman" w:hAnsi="Times New Roman"/>
           <w:sz w:val="20"/>
         </w:rPr>
-        <w:t xml:space="preserve">To ensure high data quality and eliminate shortcuts that might cause model overfitting, a rigorous bilingual preprocessing pipeline was designed. First, all HTML tags, hyperlinks, and non-alphabetical characters were stripped using regular expressions. Second, all text was normalized to lowercase. Third, a de-biasing filter was applied to remove publisher-specific source tags (e.g., 'Reuters', 'Associated Press', 'Bernama', 'Sinar Harian') and municipal city names (e.g., 'Kuala Lumpur', 'Putrajaya', 'Melaka') to force the model to learn sentence structure and tone rather than specific publisher signatures. Finally, we compiled and applied a comprehensive bilingual stopword dictionary combining English and Bahasa Malaysia stopwords, </w:t>
-      </w:r>
-      <w:r>
-        <w:rPr>
-          <w:rFonts w:ascii="Times New Roman" w:hAnsi="Times New Roman"/>
-          <w:sz w:val="20"/>
-        </w:rPr>
-        <w:lastRenderedPageBreak/>
-        <w:t>filtering out noisy terms and words with fewer than three characters. The preprocessed output was saved as a unified clean_text attribute.</w:t>
+        <w:t>To ensure high data quality and eliminate shortcuts that might cause model overfitting, a rigorous bilingual preprocessing pipeline was designed. First, all HTML tags, hyperlinks, and non-alphabetical characters were stripped using regular expressions. Second, all text was normalized to lowercase. Third, a de-biasing filter was applied to remove publisher-specific source tags (e.g., 'Reuters', 'Associated Press', 'Bernama', 'Sinar Harian') and municipal city names (e.g., 'Kuala Lumpur', 'Putrajaya', 'Melaka') to force the model to learn sentence structure and tone rather than specific publisher signatures. Finally, we compiled and applied a comprehensive bilingual stopword dictionary combining English and Bahasa Malaysia stopwords, filtering out noisy terms and words with fewer than three characters. The preprocessed output was saved as a unified clean_text attribute.</w:t>
       </w:r>
     </w:p>
     <w:p>
@@ -452,7 +458,14 @@
           <w:rFonts w:ascii="Times New Roman" w:hAnsi="Times New Roman"/>
           <w:sz w:val="20"/>
         </w:rPr>
-        <w:t>where C is the capitalization ratio (percentage of uppercase words excluding abbreviations), E is the exclamation density (the count of exclamation marks capped at 3), and T is the trigger word hit ratio (matches with a predefined bilingual dictionary of clickbait terms such as 'viral', '</w:t>
+        <w:t xml:space="preserve">where C is the capitalization ratio (percentage of uppercase words excluding abbreviations), E is the exclamation density (the count of exclamation marks capped at 3), and T is the trigger word hit ratio (matches with a predefined </w:t>
+      </w:r>
+      <w:r>
+        <w:rPr>
+          <w:rFonts w:ascii="Times New Roman" w:hAnsi="Times New Roman"/>
+          <w:sz w:val="20"/>
+        </w:rPr>
+        <w:t>bilingual dictionary of clickbait terms such as 'viral', '</w:t>
       </w:r>
       <w:proofErr w:type="spellStart"/>
       <w:r>
@@ -550,26 +563,20 @@
         <w:jc w:val="both"/>
       </w:pPr>
       <w:r>
-        <w:t>The system separates offline training from online prediction. The backend API is built using FastAPI (Python 3.10+), which loads the serialized models on startup using pickle. The frontend dashboard is constructed with clean, semantic HTML, vanilla CSS, and vanilla JavaScript. Dynamic charts (such as top fake/real keywords based on model weights) are pulled directly from the API endpoints, and a custom canvas-rendered word frequency cloud displays the word signals of the analyzed text. The entire stack is deployed on Vercel's serverless platform, routing API traffic and serving static assets from an optimized CDN. To protect the serverless backend from denial-of-service (DoS) attempts and compute billing spikes, an asynchronous Edge Middleware (middleware.js) is deployed at the Vercel CDN layer. This middleware intercepts all incoming requests to /api/predict at the edge and enforces a rate limit of 10 requests per minute per IP address. The rate limiter maintains client request counts in a cloud-hosted Upstash Redis key-value store using direct pipeline HTTP/REST commands, reverting to a fail-open fallback if the database becomes unreachable.</w:t>
+        <w:t xml:space="preserve">The system separates offline training from online prediction. The backend API is built using FastAPI (Python 3.10+), which loads the serialized models on startup using pickle. The frontend dashboard is constructed with clean, semantic HTML, vanilla CSS, and vanilla JavaScript. Dynamic charts (such as top fake/real keywords based on model weights) are pulled directly from the API endpoints, and a custom canvas-rendered word frequency cloud displays the word signals of the analyzed text. The entire stack is deployed on Vercel's serverless platform, routing API traffic and serving static assets from an optimized CDN. To protect the serverless backend from denial-of-service (DoS) attempts and compute billing spikes, an asynchronous Edge Middleware (middleware.js) is deployed at the Vercel CDN layer. This middleware intercepts all incoming </w:t>
+      </w:r>
+      <w:r>
+        <w:lastRenderedPageBreak/>
+        <w:t>requests to /api/predict at the edge and enforces a rate limit of 10 requests per minute per IP address. The rate limiter maintains client request counts in a cloud-hosted Upstash Redis key-value store using direct pipeline HTTP/REST commands, reverting to a fail-open fallback if the database becomes unreachable.</w:t>
       </w:r>
     </w:p>
     <w:p>
-      <w:r>
-        <w:br w:type="page"/>
-      </w:r>
-    </w:p>
-    <w:p>
-      <w:pPr>
-        <w:keepNext/>
-        <w:spacing w:before="240" w:after="120"/>
-      </w:pPr>
       <w:r>
         <w:rPr>
           <w:rFonts w:ascii="Times New Roman" w:hAnsi="Times New Roman"/>
           <w:b/>
           <w:sz w:val="24"/>
         </w:rPr>
-        <w:lastRenderedPageBreak/>
         <w:t>4 Experimental Results</w:t>
       </w:r>
     </w:p>
@@ -615,10 +622,10 @@
         <w:tblLook w:val="04A0" w:firstRow="1" w:lastRow="0" w:firstColumn="1" w:lastColumn="0" w:noHBand="0" w:noVBand="1"/>
       </w:tblPr>
       <w:tblGrid>
-        <w:gridCol w:w="2160"/>
-        <w:gridCol w:w="2160"/>
-        <w:gridCol w:w="2160"/>
-        <w:gridCol w:w="2160"/>
+        <w:gridCol w:w="1195"/>
+        <w:gridCol w:w="1071"/>
+        <w:gridCol w:w="766"/>
+        <w:gridCol w:w="1228"/>
       </w:tblGrid>
       <w:tr>
         <w:trPr>
@@ -1183,9 +1190,9 @@
           <w:noProof/>
         </w:rPr>
         <w:drawing>
-          <wp:inline distT="0" distB="0" distL="0" distR="0" wp14:anchorId="1E177E42" wp14:editId="06535FB4">
-            <wp:extent cx="4114800" cy="1136882"/>
-            <wp:effectExtent l="0" t="0" r="0" b="0"/>
+          <wp:inline distT="0" distB="0" distL="0" distR="0" wp14:anchorId="1E177E42" wp14:editId="731FCE6F">
+            <wp:extent cx="2520772" cy="696467"/>
+            <wp:effectExtent l="0" t="0" r="0" b="8890"/>
             <wp:docPr id="2" name="Picture 2"/>
             <wp:cNvGraphicFramePr>
               <a:graphicFrameLocks xmlns:a="http://schemas.openxmlformats.org/drawingml/2006/main" noChangeAspect="1"/>
@@ -1206,7 +1213,7 @@
                   <pic:spPr>
                     <a:xfrm>
                       <a:off x="0" y="0"/>
-                      <a:ext cx="4114800" cy="1136882"/>
+                      <a:ext cx="2555214" cy="705983"/>
                     </a:xfrm>
                     <a:prstGeom prst="rect">
                       <a:avLst/>
@@ -1273,15 +1280,7 @@
           <w:rFonts w:ascii="Times New Roman" w:hAnsi="Times New Roman"/>
           <w:sz w:val="20"/>
         </w:rPr>
-        <w:t xml:space="preserve">' </w:t>
-      </w:r>
-      <w:r>
-        <w:rPr>
-          <w:rFonts w:ascii="Times New Roman" w:hAnsi="Times New Roman"/>
-          <w:sz w:val="20"/>
-        </w:rPr>
-        <w:lastRenderedPageBreak/>
-        <w:t>(source), '</w:t>
+        <w:t>' (source), '</w:t>
       </w:r>
       <w:proofErr w:type="spellStart"/>
       <w:r>
@@ -1473,7 +1472,15 @@
           <w:rFonts w:ascii="Times New Roman" w:hAnsi="Times New Roman"/>
           <w:sz w:val="20"/>
         </w:rPr>
-        <w:t>', and 'twitter'. These words represent formal journalistic attribution verbs and official administrative honorifics, reflecting the objective and structured style typical of official publications.</w:t>
+        <w:t xml:space="preserve">', and 'twitter'. These words represent formal journalistic attribution verbs and official administrative honorifics, reflecting the objective </w:t>
+      </w:r>
+      <w:r>
+        <w:rPr>
+          <w:rFonts w:ascii="Times New Roman" w:hAnsi="Times New Roman"/>
+          <w:sz w:val="20"/>
+        </w:rPr>
+        <w:lastRenderedPageBreak/>
+        <w:t>and structured style typical of official publications.</w:t>
       </w:r>
     </w:p>
     <w:p>
@@ -1486,9 +1493,9 @@
           <w:noProof/>
         </w:rPr>
         <w:drawing>
-          <wp:inline distT="0" distB="0" distL="0" distR="0" wp14:anchorId="478B38EF" wp14:editId="4313F9AC">
-            <wp:extent cx="4114800" cy="3290174"/>
-            <wp:effectExtent l="0" t="0" r="0" b="0"/>
+          <wp:inline distT="0" distB="0" distL="0" distR="0" wp14:anchorId="478B38EF" wp14:editId="33464D64">
+            <wp:extent cx="2513885" cy="2010091"/>
+            <wp:effectExtent l="0" t="0" r="1270" b="0"/>
             <wp:docPr id="3" name="Picture 3"/>
             <wp:cNvGraphicFramePr>
               <a:graphicFrameLocks xmlns:a="http://schemas.openxmlformats.org/drawingml/2006/main" noChangeAspect="1"/>
@@ -1509,7 +1516,7 @@
                   <pic:spPr>
                     <a:xfrm>
                       <a:off x="0" y="0"/>
-                      <a:ext cx="4114800" cy="3290174"/>
+                      <a:ext cx="2539990" cy="2030964"/>
                     </a:xfrm>
                     <a:prstGeom prst="rect">
                       <a:avLst/>
@@ -1569,9 +1576,9 @@
           <w:noProof/>
         </w:rPr>
         <w:drawing>
-          <wp:inline distT="0" distB="0" distL="0" distR="0" wp14:anchorId="705E14F2" wp14:editId="64568378">
-            <wp:extent cx="3840480" cy="1225807"/>
-            <wp:effectExtent l="0" t="0" r="0" b="0"/>
+          <wp:inline distT="0" distB="0" distL="0" distR="0" wp14:anchorId="705E14F2" wp14:editId="121BEA87">
+            <wp:extent cx="2526978" cy="806563"/>
+            <wp:effectExtent l="0" t="0" r="6985" b="0"/>
             <wp:docPr id="4" name="Picture 4"/>
             <wp:cNvGraphicFramePr>
               <a:graphicFrameLocks xmlns:a="http://schemas.openxmlformats.org/drawingml/2006/main" noChangeAspect="1"/>
@@ -1592,7 +1599,7 @@
                   <pic:spPr>
                     <a:xfrm>
                       <a:off x="0" y="0"/>
-                      <a:ext cx="3840480" cy="1225807"/>
+                      <a:ext cx="2549570" cy="813774"/>
                     </a:xfrm>
                     <a:prstGeom prst="rect">
                       <a:avLst/>
@@ -1629,15 +1636,7 @@
           <w:rFonts w:ascii="Times New Roman" w:hAnsi="Times New Roman"/>
           <w:sz w:val="20"/>
         </w:rPr>
-        <w:t xml:space="preserve">To support continuous system auditing and model improvement, a user feedback mechanism is integrated directly into the web interface. Citizens or municipal officers can report misclassified articles (such as false </w:t>
-      </w:r>
-      <w:r>
-        <w:rPr>
-          <w:rFonts w:ascii="Times New Roman" w:hAnsi="Times New Roman"/>
-          <w:sz w:val="20"/>
-        </w:rPr>
-        <w:lastRenderedPageBreak/>
-        <w:t>positives or missed rumors) using a form connected to Web3Forms. Submitting a report triggers an asynchronous HTTP POST request that forwards the user's comments alongside the raw text, predicted label, confidence score, and language metadata to a central dashboard. This feedback loop provides</w:t>
+        <w:t>To support continuous system auditing and model improvement, a user feedback mechanism is integrated directly into the web interface. Citizens or municipal officers can report misclassified articles (such as false positives or missed rumors) using a form connected to Web3Forms. Submitting a report triggers an asynchronous HTTP POST request that forwards the user's comments alongside the raw text, predicted label, confidence score, and language metadata to a central dashboard. This feedback loop provides</w:t>
       </w:r>
       <w:r>
         <w:rPr>
@@ -1735,7 +1734,15 @@
           <w:rFonts w:ascii="Times New Roman" w:hAnsi="Times New Roman"/>
           <w:sz w:val="20"/>
         </w:rPr>
-        <w:t xml:space="preserve">The system is currently constrained by its reliance on a static model checkpoint, rule-based clickbait lexicons, and a bilingual focus. Future work will focus on expanding the corpus to a larger and more balanced dataset by harvesting additional local news archives and social media feeds to minimize classification bias. Furthermore, we plan to extend the system's capabilities with multilingual support, incorporating Chinese and Tamil text parsing to capture the full linguistic diversity in Malaysia. Other promising avenues include implementing active learning loops to automatically ingest and label user feedback reports for semi-supervised model refinement, integrating real-time fact-checking API endpoints to cross-verify claims with existing databases, and deploying lightweight transformer models (such as </w:t>
+        <w:t xml:space="preserve">The system is currently constrained by its reliance on a static model checkpoint, rule-based clickbait lexicons, and a bilingual focus. Future work will focus on expanding the corpus to a larger and more balanced dataset by harvesting </w:t>
+      </w:r>
+      <w:r>
+        <w:rPr>
+          <w:rFonts w:ascii="Times New Roman" w:hAnsi="Times New Roman"/>
+          <w:sz w:val="20"/>
+        </w:rPr>
+        <w:lastRenderedPageBreak/>
+        <w:t xml:space="preserve">additional local news archives and social media feeds to minimize classification bias. Furthermore, we plan to extend the system's capabilities with multilingual support, incorporating Chinese and Tamil text parsing to capture the full linguistic diversity in Malaysia. Other promising avenues include implementing active learning loops to automatically ingest and label user feedback reports for semi-supervised model refinement, integrating real-time fact-checking API endpoints to cross-verify claims with existing databases, and deploying lightweight transformer models (such as </w:t>
       </w:r>
       <w:proofErr w:type="spellStart"/>
       <w:r>
@@ -1756,15 +1763,11 @@
     </w:p>
     <w:p>
       <w:r>
-        <w:br w:type="page"/>
-      </w:r>
-      <w:r>
         <w:rPr>
           <w:rFonts w:ascii="Times New Roman" w:hAnsi="Times New Roman"/>
           <w:b/>
           <w:sz w:val="24"/>
         </w:rPr>
-        <w:lastRenderedPageBreak/>
         <w:t>References</w:t>
       </w:r>
     </w:p>
@@ -2193,7 +2196,7 @@
     <w:sectPr>
       <w:pgSz w:w="12240" w:h="15840"/>
       <w:pgMar w:top="1440" w:right="1800" w:bottom="1440" w:left="1800" w:header="720" w:footer="720" w:gutter="0"/>
-      <w:cols w:space="720"/>
+      <w:cols w:num="2" w:space="720"/>
       <w:docGrid w:linePitch="360"/>
     </w:sectPr>
   </w:body>

</xml_diff>